<commit_message>
docs: enhance consolidation handover report with visual UI screenshots and complete Postcode.my directory
</commit_message>
<xml_diff>
--- a/MST_Client_Consolidation_Response_and_Handover_Report.docx
+++ b/MST_Client_Consolidation_Response_and_Handover_Report.docx
@@ -42,7 +42,7 @@
                 <w:rFonts w:ascii="Calibri" w:hAnsi="Calibri"/>
                 <w:b/>
                 <w:color w:val="FFFFFF"/>
-                <w:sz w:val="29"/>
+                <w:sz w:val="28"/>
               </w:rPr>
               <w:t>CLIENT REQUIREMENTS CONSOLIDATION, ZONE A SPECIFICATION</w:t>
               <w:br/>
@@ -54,9 +54,9 @@
                 <w:rFonts w:ascii="Calibri" w:hAnsi="Calibri"/>
                 <w:i/>
                 <w:color w:val="E0F2FE"/>
-                <w:sz w:val="20"/>
+                <w:sz w:val="19"/>
               </w:rPr>
-              <w:t>Formal Technical Response, Postcode Directory (Postcode.my), Operational Manual &amp; Handover Roadmap</w:t>
+              <w:t>Formal Technical Response, Postcode.my Reference Directory, Illustrated Admin Manual, Promotion Analysis &amp; Handover Roadmap</w:t>
             </w:r>
           </w:p>
         </w:tc>
@@ -116,7 +116,7 @@
                 <w:color w:val="0F172A"/>
                 <w:sz w:val="17"/>
               </w:rPr>
-              <w:t>MST Management &amp; Client Representative</w:t>
+              <w:t>Wendy (Client Project Lead) &amp; MST Management</w:t>
             </w:r>
           </w:p>
         </w:tc>
@@ -186,7 +186,7 @@
                 <w:color w:val="0F172A"/>
                 <w:sz w:val="17"/>
               </w:rPr>
-              <w:t>MST-UAT-CONSOLIDATION-2026-V1</w:t>
+              <w:t>MST-UAT-CONSOLIDATION-2026-FINAL</w:t>
             </w:r>
           </w:p>
         </w:tc>
@@ -256,7 +256,7 @@
                 <w:color w:val="0F172A"/>
                 <w:sz w:val="17"/>
               </w:rPr>
-              <w:t>Laravel Unified B2B &amp; B2C Production Engine</w:t>
+              <w:t>Laravel Unified B2B &amp; B2C Cold-Chain Engine</w:t>
             </w:r>
           </w:p>
         </w:tc>
@@ -290,7 +290,7 @@
                 <w:color w:val="0F172A"/>
                 <w:sz w:val="17"/>
               </w:rPr>
-              <w:t>Official Response &amp; Action Plan Ready</w:t>
+              <w:t>Official Response &amp; Action Plan Ready for Final UAT</w:t>
             </w:r>
           </w:p>
         </w:tc>
@@ -349,7 +349,13 @@
                 <w:color w:val="1E293B"/>
                 <w:sz w:val="19"/>
               </w:rPr>
-              <w:t>Thank you for your comprehensive consolidation message. We have carefully reviewed every requirement regarding Zone A delivery coverage, delivery fee rules, backend administration, promotions/discounts, and final handover. All code updates regarding Skudai (81300) and Kulai (Indahpura only) have been implemented and aligned. This document provides the compiled Postcode.my directory for your review, a complete step-by-step Admin Operation Manual, a transparent review of the coupon/marketing attribution architecture, and our final handover confirmation.</w:t>
+              <w:t>Dear Wendy,</w:t>
+              <w:br/>
+              <w:br/>
+              <w:t>Thank you for your comprehensive consolidation message. We have carefully reviewed and systematically addressed every requirement regarding MST Zone A delivery coverage, delivery fee rules, backend administration, promotions/discounts, and final handover.</w:t>
+              <w:br/>
+              <w:br/>
+              <w:t>All code updates regarding Skudai (81300) and Kulai (Indahpura only) have been implemented, tested, and pushed to the live deployment pipeline. This document provides the complete compiled Postcode.my directory for your review, a step-by-step illustrated Admin Operation Manual, a transparent technical review of the requested coupon/marketing attribution architecture, and our final handover roadmap.</w:t>
             </w:r>
           </w:p>
         </w:tc>
@@ -1965,7 +1971,7 @@
                 <w:color w:val="1E293B"/>
                 <w:sz w:val="16"/>
               </w:rPr>
-              <w:t>79000, 79100, 79200, 79250</w:t>
+              <w:t>79000, 79100, 79200, 79250, 79500</w:t>
             </w:r>
           </w:p>
         </w:tc>
@@ -2237,6 +2243,186 @@
         <w:rPr>
           <w:rFonts w:ascii="Calibri" w:hAnsi="Calibri"/>
           <w:b/>
+          <w:color w:val="1D4ED8"/>
+          <w:sz w:val="22"/>
+        </w:rPr>
+        <w:t>Visual Evidence: Verified Cart &amp; Checkout Delivery Behaviors</w:t>
+      </w:r>
+    </w:p>
+    <w:p>
+      <w:pPr>
+        <w:spacing w:before="120" w:after="40"/>
+        <w:jc w:val="center"/>
+      </w:pPr>
+      <w:r>
+        <w:drawing>
+          <wp:inline xmlns:a="http://schemas.openxmlformats.org/drawingml/2006/main" xmlns:pic="http://schemas.openxmlformats.org/drawingml/2006/picture">
+            <wp:extent cx="5669280" cy="3275584"/>
+            <wp:docPr id="1" name="Picture 1"/>
+            <wp:cNvGraphicFramePr>
+              <a:graphicFrameLocks noChangeAspect="1"/>
+            </wp:cNvGraphicFramePr>
+            <a:graphic>
+              <a:graphicData uri="http://schemas.openxmlformats.org/drawingml/2006/picture">
+                <pic:pic>
+                  <pic:nvPicPr>
+                    <pic:cNvPr id="0" name="01_cart_rm93_below_threshold.png"/>
+                    <pic:cNvPicPr/>
+                  </pic:nvPicPr>
+                  <pic:blipFill>
+                    <a:blip r:embed="rId9"/>
+                    <a:stretch>
+                      <a:fillRect/>
+                    </a:stretch>
+                  </pic:blipFill>
+                  <pic:spPr>
+                    <a:xfrm>
+                      <a:off x="0" y="0"/>
+                      <a:ext cx="5669280" cy="3275584"/>
+                    </a:xfrm>
+                    <a:prstGeom prst="rect"/>
+                  </pic:spPr>
+                </pic:pic>
+              </a:graphicData>
+            </a:graphic>
+          </wp:inline>
+        </w:drawing>
+      </w:r>
+    </w:p>
+    <w:p>
+      <w:pPr>
+        <w:spacing w:before="40" w:after="160"/>
+        <w:jc w:val="center"/>
+      </w:pPr>
+      <w:r>
+        <w:rPr>
+          <w:rFonts w:ascii="Calibri" w:hAnsi="Calibri"/>
+          <w:i/>
+          <w:color w:val="475569"/>
+          <w:sz w:val="17"/>
+        </w:rPr>
+        <w:t>Figure: Shopping Cart showing RM10 delivery fee and dynamic spend tracker toward the RM150 free delivery threshold.</w:t>
+      </w:r>
+    </w:p>
+    <w:p>
+      <w:pPr>
+        <w:spacing w:before="120" w:after="40"/>
+        <w:jc w:val="center"/>
+      </w:pPr>
+      <w:r>
+        <w:drawing>
+          <wp:inline xmlns:a="http://schemas.openxmlformats.org/drawingml/2006/main" xmlns:pic="http://schemas.openxmlformats.org/drawingml/2006/picture">
+            <wp:extent cx="5669280" cy="3527552"/>
+            <wp:docPr id="2" name="Picture 2"/>
+            <wp:cNvGraphicFramePr>
+              <a:graphicFrameLocks noChangeAspect="1"/>
+            </wp:cNvGraphicFramePr>
+            <a:graphic>
+              <a:graphicData uri="http://schemas.openxmlformats.org/drawingml/2006/picture">
+                <pic:pic>
+                  <pic:nvPicPr>
+                    <pic:cNvPr id="0" name="03_checkout_delivery_rm93_single_fee.png"/>
+                    <pic:cNvPicPr/>
+                  </pic:nvPicPr>
+                  <pic:blipFill>
+                    <a:blip r:embed="rId10"/>
+                    <a:stretch>
+                      <a:fillRect/>
+                    </a:stretch>
+                  </pic:blipFill>
+                  <pic:spPr>
+                    <a:xfrm>
+                      <a:off x="0" y="0"/>
+                      <a:ext cx="5669280" cy="3527552"/>
+                    </a:xfrm>
+                    <a:prstGeom prst="rect"/>
+                  </pic:spPr>
+                </pic:pic>
+              </a:graphicData>
+            </a:graphic>
+          </wp:inline>
+        </w:drawing>
+      </w:r>
+    </w:p>
+    <w:p>
+      <w:pPr>
+        <w:spacing w:before="40" w:after="160"/>
+        <w:jc w:val="center"/>
+      </w:pPr>
+      <w:r>
+        <w:rPr>
+          <w:rFonts w:ascii="Calibri" w:hAnsi="Calibri"/>
+          <w:i/>
+          <w:color w:val="475569"/>
+          <w:sz w:val="17"/>
+        </w:rPr>
+        <w:t>Figure: Live Checkout page displaying the Zone A lead-time notice, address fields, and single itemized RM10 fee.</w:t>
+      </w:r>
+    </w:p>
+    <w:p>
+      <w:pPr>
+        <w:spacing w:before="120" w:after="40"/>
+        <w:jc w:val="center"/>
+      </w:pPr>
+      <w:r>
+        <w:drawing>
+          <wp:inline xmlns:a="http://schemas.openxmlformats.org/drawingml/2006/main" xmlns:pic="http://schemas.openxmlformats.org/drawingml/2006/picture">
+            <wp:extent cx="5669280" cy="3527552"/>
+            <wp:docPr id="3" name="Picture 3"/>
+            <wp:cNvGraphicFramePr>
+              <a:graphicFrameLocks noChangeAspect="1"/>
+            </wp:cNvGraphicFramePr>
+            <a:graphic>
+              <a:graphicData uri="http://schemas.openxmlformats.org/drawingml/2006/picture">
+                <pic:pic>
+                  <pic:nvPicPr>
+                    <pic:cNvPr id="0" name="04_checkout_self_collection_rm93.png"/>
+                    <pic:cNvPicPr/>
+                  </pic:nvPicPr>
+                  <pic:blipFill>
+                    <a:blip r:embed="rId11"/>
+                    <a:stretch>
+                      <a:fillRect/>
+                    </a:stretch>
+                  </pic:blipFill>
+                  <pic:spPr>
+                    <a:xfrm>
+                      <a:off x="0" y="0"/>
+                      <a:ext cx="5669280" cy="3527552"/>
+                    </a:xfrm>
+                    <a:prstGeom prst="rect"/>
+                  </pic:spPr>
+                </pic:pic>
+              </a:graphicData>
+            </a:graphic>
+          </wp:inline>
+        </w:drawing>
+      </w:r>
+    </w:p>
+    <w:p>
+      <w:pPr>
+        <w:spacing w:before="40" w:after="160"/>
+        <w:jc w:val="center"/>
+      </w:pPr>
+      <w:r>
+        <w:rPr>
+          <w:rFonts w:ascii="Calibri" w:hAnsi="Calibri"/>
+          <w:i/>
+          <w:color w:val="475569"/>
+          <w:sz w:val="17"/>
+        </w:rPr>
+        <w:t>Figure: Checkout with Self-Collection selected: Delivery address hidden, collection date and time slots required, RM0.00 fee.</w:t>
+      </w:r>
+    </w:p>
+    <w:p>
+      <w:pPr>
+        <w:keepNext/>
+        <w:spacing w:before="280" w:after="80"/>
+      </w:pPr>
+      <w:r>
+        <w:rPr>
+          <w:rFonts w:ascii="Calibri" w:hAnsi="Calibri"/>
+          <w:b/>
           <w:color w:val="0F274A"/>
           <w:sz w:val="26"/>
         </w:rPr>
@@ -2286,7 +2472,7 @@
           <w:color w:val="0F274A"/>
           <w:sz w:val="19"/>
         </w:rPr>
-        <w:t xml:space="preserve">Step 1: </w:t>
+        <w:t xml:space="preserve">Step 1 — Access: </w:t>
       </w:r>
       <w:r>
         <w:rPr>
@@ -2310,7 +2496,7 @@
           <w:color w:val="0F274A"/>
           <w:sz w:val="19"/>
         </w:rPr>
-        <w:t xml:space="preserve">Step 2: </w:t>
+        <w:t xml:space="preserve">Step 2 — Location: </w:t>
       </w:r>
       <w:r>
         <w:rPr>
@@ -2334,7 +2520,7 @@
           <w:color w:val="0F274A"/>
           <w:sz w:val="19"/>
         </w:rPr>
-        <w:t xml:space="preserve">Step 3: </w:t>
+        <w:t xml:space="preserve">Step 3 — Editable Fields: </w:t>
       </w:r>
       <w:r>
         <w:rPr>
@@ -2358,7 +2544,7 @@
           <w:color w:val="0F274A"/>
           <w:sz w:val="19"/>
         </w:rPr>
-        <w:t xml:space="preserve">Step 4: </w:t>
+        <w:t xml:space="preserve">Step 4 — Confirmation: </w:t>
       </w:r>
       <w:r>
         <w:rPr>

</xml_diff>